<commit_message>
docs: BRD v5.4 + User Flow v1.2 — flow correction and single-action transitions
BRD v5.4:
- Section 41 (already present): Phase 6k — Pipeline Stage Alignment + Async WhatsApp Screening
- Section 42 (new): Single-Action Stage Transitions — one "Approve to [next]" button per stage, the 5 transitions documented, secondary actions listed
- Section 43 (new): WhatsApp Screening Simulation (Phase 6j) — endpoint spec, 60/25/15 mixed-tone distribution, AI-proposes-recruiter-decides principle, triggering paths (production vs staging)

User Flow v1.2:
- Section C fully revised: C3 approves Applied→L1 (WhatsApp sim triggers), C4 async screening run, C5 commitment+salary+composite, C6 approve to L2, C7 L2/L3/Final (Phase 7)
- Implementation status refreshed for v1.8.0 — steps 0 through C6 working end-to-end, C7 schema ready + UI deferred

Co-Authored-By: Claude Opus 4.7 (1M context) <noreply@anthropic.com>
</commit_message>
<xml_diff>
--- a/docs/HireIQ_BRD_v5.4.docx
+++ b/docs/HireIQ_BRD_v5.4.docx
@@ -7707,6 +7707,194 @@
     <w:p>
       <w:r>
         <w:t>CV match and commitment are fundamentally different signals gathered at different times. Showing a pre-WhatsApp composite misled recruiters into thinking screening was done when it was not. Splitting the stages makes the UI honest, lets recruiters make each decision with the right information, and defers expensive Claude calls until the recruiter explicitly opts in (one Applied drawer click = one paid screening).</w:t>
+      </w:r>
+    </w:p>
+    <w:p>
+      <w:r>
+        <w:rPr>
+          <w:b/>
+        </w:rPr>
+        <w:t>SECTION 42</w:t>
+      </w:r>
+    </w:p>
+    <w:p>
+      <w:r>
+        <w:rPr>
+          <w:b/>
+        </w:rPr>
+        <w:t>Single-Action Stage Transitions</w:t>
+      </w:r>
+    </w:p>
+    <w:p>
+      <w:r>
+        <w:rPr>
+          <w:b/>
+        </w:rPr>
+        <w:t>Principle</w:t>
+      </w:r>
+    </w:p>
+    <w:p>
+      <w:r>
+        <w:t>Each pipeline stage has exactly one primary button: "Approve to [next level]". The approval action is the decision — it simultaneously triggers every automated side-effect the next stage needs (WhatsApp simulation, scoring recomputation, audit log, socket emit). No separate "invite" / "trigger" / "send" steps.</w:t>
+      </w:r>
+    </w:p>
+    <w:p>
+      <w:r>
+        <w:t>Why: splitting approve from invite adds ceremony without changing the recruiter decision. If a recruiter has seen the CV Match + hard filter + AI recommendation, approving IS the commitment to move forward. One decision per drawer, one button per stage.</w:t>
+      </w:r>
+    </w:p>
+    <w:p>
+      <w:r>
+        <w:rPr>
+          <w:b/>
+        </w:rPr>
+        <w:t>The five stage transitions</w:t>
+      </w:r>
+    </w:p>
+    <w:p>
+      <w:r>
+        <w:t>• Applied → L1 CV Screened — button "Approve to L1". Confirmation modal warns about paid Claude call (this is the one transition that spends money). On confirm: stage=shortlisted, WhatsApp screening fires fire-and-forget on the backend, card shows "🔄 Screening…" badge for ~15-30s, then full composite + L2 recommendation land.</w:t>
+      </w:r>
+    </w:p>
+    <w:p>
+      <w:r>
+        <w:t>• L1 → L2 WA Screened — button "Approve to L2". Single click, no modal. Recruiter has reviewed composite + commitment + salary.</w:t>
+      </w:r>
+    </w:p>
+    <w:p>
+      <w:r>
+        <w:t>• L2 → L3 Interviewed — button "Approve to L3". Single click. Requires recruiter to have entered technical interview score + notes (Phase 7 UI).</w:t>
+      </w:r>
+    </w:p>
+    <w:p>
+      <w:r>
+        <w:t>• L3 → Final Shortlist — button "Approve to Final". Single click. Requires culture interview score + notes (Phase 7 UI).</w:t>
+      </w:r>
+    </w:p>
+    <w:p>
+      <w:r>
+        <w:t>• Final → Hired — button "Approve to Hired" (from Final drawer). Terminal stage after.</w:t>
+      </w:r>
+    </w:p>
+    <w:p>
+      <w:r>
+        <w:rPr>
+          <w:b/>
+        </w:rPr>
+        <w:t>Secondary actions</w:t>
+      </w:r>
+    </w:p>
+    <w:p>
+      <w:r>
+        <w:t>• Hold (amber) — moves candidate out of the active funnel into a held state. Available on every stage.</w:t>
+      </w:r>
+    </w:p>
+    <w:p>
+      <w:r>
+        <w:t>• Reject (red) — opens a reason picker. Available on every stage.</w:t>
+      </w:r>
+    </w:p>
+    <w:p>
+      <w:r>
+        <w:t>• Backward drag on kanban — allowed, logs a warn entry, recomputes AI recommendation for the new next-stage.</w:t>
+      </w:r>
+    </w:p>
+    <w:p>
+      <w:r>
+        <w:rPr>
+          <w:b/>
+        </w:rPr>
+        <w:t>SECTION 43</w:t>
+      </w:r>
+    </w:p>
+    <w:p>
+      <w:r>
+        <w:rPr>
+          <w:b/>
+        </w:rPr>
+        <w:t>WhatsApp Screening Simulation (Phase 6j)</w:t>
+      </w:r>
+    </w:p>
+    <w:p>
+      <w:r>
+        <w:rPr>
+          <w:b/>
+        </w:rPr>
+        <w:t>Endpoint</w:t>
+      </w:r>
+    </w:p>
+    <w:p>
+      <w:r>
+        <w:t>POST /mock/simulate-screening — accepts { candidateId }. Generates 5 canned answers keyed to each job screening question type (motivation / experience / salary / availability / skill_probe). Evaluates each via /api/v1/ai/evaluate-answer (Claude). Triggers /api/v1/ai/score on completion. Writes full composite + L2 aiRecommendation. Total run ~15-30s depending on Claude latency.</w:t>
+      </w:r>
+    </w:p>
+    <w:p>
+      <w:r>
+        <w:t>In Phase 7 this endpoint is replaced by real 360dialog WhatsApp webhooks. Payload structure is identical.</w:t>
+      </w:r>
+    </w:p>
+    <w:p>
+      <w:r>
+        <w:rPr>
+          <w:b/>
+        </w:rPr>
+        <w:t>Tone distribution (mixed-tone simulation)</w:t>
+      </w:r>
+    </w:p>
+    <w:p>
+      <w:r>
+        <w:t>Each simulation picks one tone per candidate:</w:t>
+      </w:r>
+    </w:p>
+    <w:p>
+      <w:r>
+        <w:t>• 60% strong — all 5 answers high-quality, typically yields advance.</w:t>
+      </w:r>
+    </w:p>
+    <w:p>
+      <w:r>
+        <w:t>• 25% mixed — answers alternate strong/vague across the 5 questions, typically yields hold (high CV match + middling commitment is the exact "worth a call" case).</w:t>
+      </w:r>
+    </w:p>
+    <w:p>
+      <w:r>
+        <w:t>• 15% vague — all answers low-effort, typically yields reject.</w:t>
+      </w:r>
+    </w:p>
+    <w:p>
+      <w:r>
+        <w:t>This produces a realistic funnel (~60% advance / 25% hold / 15% reject across a batch) instead of a binary pass/fail distribution. Recruiters watching a demo see drop-off as a feature, not a bug.</w:t>
+      </w:r>
+    </w:p>
+    <w:p>
+      <w:r>
+        <w:rPr>
+          <w:b/>
+        </w:rPr>
+        <w:t>AI recommendation principle (applies everywhere, not just sim)</w:t>
+      </w:r>
+    </w:p>
+    <w:p>
+      <w:r>
+        <w:t>AI proposes, recruiter decides — at EVERY stage transition. Simulation writes scores + a recommendation. It does NOT change pipelineStage. The recruiter must click Approve to move the candidate. This is enforced at the API level: /api/v1/ai/score never sets pipelineStage; PATCH /candidates/:id/status is the only write path for stage changes.</w:t>
+      </w:r>
+    </w:p>
+    <w:p>
+      <w:r>
+        <w:rPr>
+          <w:b/>
+        </w:rPr>
+        <w:t>Triggering paths</w:t>
+      </w:r>
+    </w:p>
+    <w:p>
+      <w:r>
+        <w:t>• Production (Phase 7): candidate replies YES to WhatsApp → 360dialog webhook → conversation handler runs the 5 questions → scoring triggers automatically.</w:t>
+      </w:r>
+    </w:p>
+    <w:p>
+      <w:r>
+        <w:t>• Staging/demo (current): recruiter clicks "Approve to L1" → simulation fires automatically on L1 entry. The old manual "Simulate" buttons on /mock still exist for admin/demo prep (labelled "(admin)") but are not the primary trigger.</w:t>
       </w:r>
     </w:p>
     <w:sectPr>

</xml_diff>